<commit_message>
Whups.  Sync first, dude.  Fixed.
</commit_message>
<xml_diff>
--- a/CMPE2150.Notes.05.SemiconductorACControl.docx
+++ b/CMPE2150.Notes.05.SemiconductorACControl.docx
@@ -73,7 +73,7 @@
         <w:pStyle w:val="Date"/>
       </w:pPr>
       <w:r>
-        <w:t xml:space="preserve">16</w:t>
+        <w:t xml:space="preserve">18</w:t>
       </w:r>
       <w:r>
         <w:t xml:space="preserve"> </w:t>
@@ -173,7 +173,7 @@
         <w:pStyle w:val="FirstParagraph"/>
       </w:pPr>
       <w:r>
-        <w:t xml:space="preserve">The BJT transistors you studied earlier are three-layer devices, either PNP or NPN. As such, they must be biased appropriately with DC power supplies: For an NPN transistor, the Collector must be at a higher voltage than the Emitter, and control is exercised by running a current through the positively-biased Base to Emitter junction. For aNP transistor, the Collector must be at a lower voltage than the Emitter, and control is exercised by running a current through the negatively-biased Base to Emitter junction.</w:t>
+        <w:t xml:space="preserve">The BJT transistors you studied earlier are three-layer devices, either PNP or NPN. As such, they must be biased appropriately with DC power supplies: For an NPN transistor, the Collector must be at a higher voltage than the Emitter, and control is exercised by running a current through the positively-biased Base to Emitter junction. For a PNP transistor, the Collector must be at a lower voltage than the Emitter, and control is exercised by running a current through the negatively-biased Base to Emitter junction.</w:t>
       </w:r>
     </w:p>
     <w:p>
@@ -222,13 +222,17 @@
           </wp:inline>
         </w:drawing>
       </w:r>
-    </w:p>
-    <w:p>
-      <w:pPr>
-        <w:pStyle w:val="BodyText"/>
-      </w:pPr>
-      <w:r>
-        <w:t xml:space="preserve">William Shockley, 1910-1989 (Wikipedia)</w:t>
+      <w:r>
+        <w:br/>
+      </w:r>
+      <w:r>
+        <w:t xml:space="preserve">William Shockley, 1910-1989</w:t>
+      </w:r>
+      <w:r>
+        <w:br/>
+      </w:r>
+      <w:r>
+        <w:t xml:space="preserve">(Wikipedia)</w:t>
       </w:r>
     </w:p>
     <w:p>
@@ -412,11 +416,9 @@
           </wp:inline>
         </w:drawing>
       </w:r>
-    </w:p>
-    <w:p>
-      <w:pPr>
-        <w:pStyle w:val="BodyText"/>
-      </w:pPr>
+      <w:r>
+        <w:br/>
+      </w:r>
       <w:r>
         <w:t xml:space="preserve">Symbol for a Shockley Diode</w:t>
       </w:r>
@@ -1226,10 +1228,16 @@
         </w:drawing>
       </w:r>
       <w:r>
-        <w:t xml:space="preserve"> </w:t>
-      </w:r>
-      <w:r>
-        <w:t xml:space="preserve">Symbol for a Silicon-Controlled Rectifier (SCR)</w:t>
+        <w:br/>
+      </w:r>
+      <w:r>
+        <w:t xml:space="preserve">Symbol for a Silicon-Controlled</w:t>
+      </w:r>
+      <w:r>
+        <w:br/>
+      </w:r>
+      <w:r>
+        <w:t xml:space="preserve">Rectifier (SCR)</w:t>
       </w:r>
     </w:p>
     <w:p>
@@ -1687,7 +1695,7 @@
         </w:drawing>
       </w:r>
       <w:r>
-        <w:t xml:space="preserve"> </w:t>
+        <w:br/>
       </w:r>
       <w:r>
         <w:t xml:space="preserve">SCR Simple Fader Circuit</w:t>
@@ -2325,7 +2333,7 @@
         </w:drawing>
       </w:r>
       <w:r>
-        <w:t xml:space="preserve"> </w:t>
+        <w:br/>
       </w:r>
       <w:r>
         <w:t xml:space="preserve">Symbol for a DIAC</w:t>
@@ -2690,22 +2698,303 @@
         <w:pStyle w:val="FirstParagraph"/>
       </w:pPr>
       <w:r>
+        <w:t xml:space="preserve">The TRIAC is the full-wave equivalent to the SCR – a device with a Gate to control both the forward and reverse breakover voltages.</w:t>
+      </w:r>
+    </w:p>
+    <w:p>
+      <w:pPr>
+        <w:pStyle w:val="BodyText"/>
+      </w:pPr>
+      <w:r>
+        <w:t xml:space="preserve">Here is a typical transfer function for a TRIAC:</w:t>
+      </w:r>
+    </w:p>
+    <w:p>
+      <w:pPr>
+        <w:pStyle w:val="CaptionedFigure"/>
+      </w:pPr>
+      <w:r>
         <w:drawing>
           <wp:inline>
-            <wp:extent cx="952500" cy="1828800"/>
+            <wp:extent cx="2857500" cy="2178963"/>
             <wp:effectExtent b="0" l="0" r="0" t="0"/>
-            <wp:docPr descr="" title="" id="74" name="Picture"/>
+            <wp:docPr descr="DIAC Transfer Function" title="" id="74" name="Picture"/>
             <a:graphic>
               <a:graphicData uri="http://schemas.openxmlformats.org/drawingml/2006/picture">
                 <pic:pic>
                   <pic:nvPicPr>
-                    <pic:cNvPr descr="images/TRIACSymbol.JPG" id="75" name="Picture"/>
+                    <pic:cNvPr descr="images/TRIACTransfer.JPG" id="75" name="Picture"/>
                     <pic:cNvPicPr>
                       <a:picLocks noChangeArrowheads="1" noChangeAspect="1"/>
                     </pic:cNvPicPr>
                   </pic:nvPicPr>
                   <pic:blipFill>
                     <a:blip r:embed="rId73"/>
+                    <a:stretch>
+                      <a:fillRect/>
+                    </a:stretch>
+                  </pic:blipFill>
+                  <pic:spPr bwMode="auto">
+                    <a:xfrm>
+                      <a:off x="0" y="0"/>
+                      <a:ext cx="2857500" cy="2178963"/>
+                    </a:xfrm>
+                    <a:prstGeom prst="rect">
+                      <a:avLst/>
+                    </a:prstGeom>
+                    <a:noFill/>
+                    <a:ln w="9525">
+                      <a:noFill/>
+                      <a:headEnd/>
+                      <a:tailEnd/>
+                    </a:ln>
+                  </pic:spPr>
+                </pic:pic>
+              </a:graphicData>
+            </a:graphic>
+          </wp:inline>
+        </w:drawing>
+      </w:r>
+    </w:p>
+    <w:p>
+      <w:pPr>
+        <w:pStyle w:val="ImageCaption"/>
+      </w:pPr>
+      <w:r>
+        <w:t xml:space="preserve">DIAC Transfer Function</w:t>
+      </w:r>
+    </w:p>
+    <w:p>
+      <w:pPr>
+        <w:pStyle w:val="BodyText"/>
+      </w:pPr>
+      <w:r>
+        <w:t xml:space="preserve">The following shows a TRIAC with basic breakover voltages much higher than the peak voltage of the power signal, with Gate current injected to trigger the device at just under</w:t>
+      </w:r>
+      <w:r>
+        <w:t xml:space="preserve"> </w:t>
+      </w:r>
+      <m:oMath>
+        <m:r>
+          <m:t>24</m:t>
+        </m:r>
+        <m:r>
+          <m:t>V</m:t>
+        </m:r>
+      </m:oMath>
+      <w:r>
+        <w:t xml:space="preserve">, then</w:t>
+      </w:r>
+      <w:r>
+        <w:t xml:space="preserve"> </w:t>
+      </w:r>
+      <m:oMath>
+        <m:r>
+          <m:t>20</m:t>
+        </m:r>
+        <m:r>
+          <m:t>V</m:t>
+        </m:r>
+      </m:oMath>
+      <w:r>
+        <w:t xml:space="preserve"> </w:t>
+      </w:r>
+      <w:r>
+        <w:t xml:space="preserve">and finally</w:t>
+      </w:r>
+      <w:r>
+        <w:t xml:space="preserve"> </w:t>
+      </w:r>
+      <m:oMath>
+        <m:r>
+          <m:t>10</m:t>
+        </m:r>
+        <m:r>
+          <m:t>V</m:t>
+        </m:r>
+      </m:oMath>
+      <w:r>
+        <w:t xml:space="preserve">.</w:t>
+      </w:r>
+    </w:p>
+    <w:p>
+      <w:pPr>
+        <w:pStyle w:val="CaptionedFigure"/>
+      </w:pPr>
+      <w:r>
+        <w:drawing>
+          <wp:inline>
+            <wp:extent cx="4410075" cy="2638425"/>
+            <wp:effectExtent b="0" l="0" r="0" t="0"/>
+            <wp:docPr descr="TRIAC Output Current" title="" id="77" name="Picture"/>
+            <a:graphic>
+              <a:graphicData uri="http://schemas.openxmlformats.org/drawingml/2006/picture">
+                <pic:pic>
+                  <pic:nvPicPr>
+                    <pic:cNvPr descr="images/TRIACCurrentTrace.JPG" id="78" name="Picture"/>
+                    <pic:cNvPicPr>
+                      <a:picLocks noChangeArrowheads="1" noChangeAspect="1"/>
+                    </pic:cNvPicPr>
+                  </pic:nvPicPr>
+                  <pic:blipFill>
+                    <a:blip r:embed="rId76"/>
+                    <a:stretch>
+                      <a:fillRect/>
+                    </a:stretch>
+                  </pic:blipFill>
+                  <pic:spPr bwMode="auto">
+                    <a:xfrm>
+                      <a:off x="0" y="0"/>
+                      <a:ext cx="4410075" cy="2638425"/>
+                    </a:xfrm>
+                    <a:prstGeom prst="rect">
+                      <a:avLst/>
+                    </a:prstGeom>
+                    <a:noFill/>
+                    <a:ln w="9525">
+                      <a:noFill/>
+                      <a:headEnd/>
+                      <a:tailEnd/>
+                    </a:ln>
+                  </pic:spPr>
+                </pic:pic>
+              </a:graphicData>
+            </a:graphic>
+          </wp:inline>
+        </w:drawing>
+      </w:r>
+    </w:p>
+    <w:p>
+      <w:pPr>
+        <w:pStyle w:val="ImageCaption"/>
+      </w:pPr>
+      <w:r>
+        <w:t xml:space="preserve">TRIAC Output Current</w:t>
+      </w:r>
+    </w:p>
+    <w:p>
+      <w:pPr>
+        <w:pStyle w:val="BodyText"/>
+      </w:pPr>
+      <w:r>
+        <w:t xml:space="preserve">Here are the matching voltage curves for the current curves in the graph above:</w:t>
+      </w:r>
+    </w:p>
+    <w:p>
+      <w:pPr>
+        <w:pStyle w:val="CaptionedFigure"/>
+      </w:pPr>
+      <w:r>
+        <w:drawing>
+          <wp:inline>
+            <wp:extent cx="4400550" cy="2628900"/>
+            <wp:effectExtent b="0" l="0" r="0" t="0"/>
+            <wp:docPr descr="TRIAC Output Voltage" title="" id="80" name="Picture"/>
+            <a:graphic>
+              <a:graphicData uri="http://schemas.openxmlformats.org/drawingml/2006/picture">
+                <pic:pic>
+                  <pic:nvPicPr>
+                    <pic:cNvPr descr="images/TRIACVoltageTrace.JPG" id="81" name="Picture"/>
+                    <pic:cNvPicPr>
+                      <a:picLocks noChangeArrowheads="1" noChangeAspect="1"/>
+                    </pic:cNvPicPr>
+                  </pic:nvPicPr>
+                  <pic:blipFill>
+                    <a:blip r:embed="rId79"/>
+                    <a:stretch>
+                      <a:fillRect/>
+                    </a:stretch>
+                  </pic:blipFill>
+                  <pic:spPr bwMode="auto">
+                    <a:xfrm>
+                      <a:off x="0" y="0"/>
+                      <a:ext cx="4400550" cy="2628900"/>
+                    </a:xfrm>
+                    <a:prstGeom prst="rect">
+                      <a:avLst/>
+                    </a:prstGeom>
+                    <a:noFill/>
+                    <a:ln w="9525">
+                      <a:noFill/>
+                      <a:headEnd/>
+                      <a:tailEnd/>
+                    </a:ln>
+                  </pic:spPr>
+                </pic:pic>
+              </a:graphicData>
+            </a:graphic>
+          </wp:inline>
+        </w:drawing>
+      </w:r>
+    </w:p>
+    <w:p>
+      <w:pPr>
+        <w:pStyle w:val="ImageCaption"/>
+      </w:pPr>
+      <w:r>
+        <w:t xml:space="preserve">TRIAC Output Voltage</w:t>
+      </w:r>
+    </w:p>
+    <w:p>
+      <w:pPr>
+        <w:pStyle w:val="BodyText"/>
+      </w:pPr>
+      <w:r>
+        <w:t xml:space="preserve">Notice that, when the TRIAC is set to turn on for most of the cycle, the signal looks like just short spikes following the zero crossing points of the incoming signal, then the device remains turned on until the next zero crossing point.</w:t>
+      </w:r>
+    </w:p>
+    <w:p>
+      <w:pPr>
+        <w:pStyle w:val="BodyText"/>
+      </w:pPr>
+      <w:r>
+        <w:t xml:space="preserve">When connecting a modern TRIAC in a circuit, the Gate phase needs to be matched to the</w:t>
+      </w:r>
+      <w:r>
+        <w:t xml:space="preserve"> </w:t>
+      </w:r>
+      <m:oMath>
+        <m:sSub>
+          <m:e>
+            <m:r>
+              <m:t>A</m:t>
+            </m:r>
+          </m:e>
+          <m:sub>
+            <m:r>
+              <m:t>1</m:t>
+            </m:r>
+          </m:sub>
+        </m:sSub>
+      </m:oMath>
+      <w:r>
+        <w:t xml:space="preserve"> </w:t>
+      </w:r>
+      <w:r>
+        <w:t xml:space="preserve">anode.</w:t>
+      </w:r>
+    </w:p>
+    <w:p>
+      <w:pPr>
+        <w:pStyle w:val="BodyText"/>
+      </w:pPr>
+      <w:r>
+        <w:drawing>
+          <wp:inline>
+            <wp:extent cx="952500" cy="1828800"/>
+            <wp:effectExtent b="0" l="0" r="0" t="0"/>
+            <wp:docPr descr="" title="" id="83" name="Picture"/>
+            <a:graphic>
+              <a:graphicData uri="http://schemas.openxmlformats.org/drawingml/2006/picture">
+                <pic:pic>
+                  <pic:nvPicPr>
+                    <pic:cNvPr descr="images/TRIACSymbol.JPG" id="84" name="Picture"/>
+                    <pic:cNvPicPr>
+                      <a:picLocks noChangeArrowheads="1" noChangeAspect="1"/>
+                    </pic:cNvPicPr>
+                  </pic:nvPicPr>
+                  <pic:blipFill>
+                    <a:blip r:embed="rId82"/>
                     <a:stretch>
                       <a:fillRect/>
                     </a:stretch>
@@ -2732,291 +3021,10 @@
         </w:drawing>
       </w:r>
       <w:r>
-        <w:t xml:space="preserve"> </w:t>
+        <w:br/>
       </w:r>
       <w:r>
         <w:t xml:space="preserve">Symbol for a TRIAC</w:t>
-      </w:r>
-    </w:p>
-    <w:p>
-      <w:pPr>
-        <w:pStyle w:val="BodyText"/>
-      </w:pPr>
-      <w:r>
-        <w:t xml:space="preserve">The TRIAC is the full-wave equivalent to the SCR – a device with a Gate to control both the forward and reverse breakover voltages.</w:t>
-      </w:r>
-    </w:p>
-    <w:p>
-      <w:pPr>
-        <w:pStyle w:val="BodyText"/>
-      </w:pPr>
-      <w:r>
-        <w:t xml:space="preserve">Here is a typical transfer function for a TRIAC:</w:t>
-      </w:r>
-    </w:p>
-    <w:p>
-      <w:pPr>
-        <w:pStyle w:val="CaptionedFigure"/>
-      </w:pPr>
-      <w:r>
-        <w:drawing>
-          <wp:inline>
-            <wp:extent cx="2857500" cy="2178963"/>
-            <wp:effectExtent b="0" l="0" r="0" t="0"/>
-            <wp:docPr descr="DIAC Transfer Function" title="" id="77" name="Picture"/>
-            <a:graphic>
-              <a:graphicData uri="http://schemas.openxmlformats.org/drawingml/2006/picture">
-                <pic:pic>
-                  <pic:nvPicPr>
-                    <pic:cNvPr descr="images/TRIACTransfer.JPG" id="78" name="Picture"/>
-                    <pic:cNvPicPr>
-                      <a:picLocks noChangeArrowheads="1" noChangeAspect="1"/>
-                    </pic:cNvPicPr>
-                  </pic:nvPicPr>
-                  <pic:blipFill>
-                    <a:blip r:embed="rId76"/>
-                    <a:stretch>
-                      <a:fillRect/>
-                    </a:stretch>
-                  </pic:blipFill>
-                  <pic:spPr bwMode="auto">
-                    <a:xfrm>
-                      <a:off x="0" y="0"/>
-                      <a:ext cx="2857500" cy="2178963"/>
-                    </a:xfrm>
-                    <a:prstGeom prst="rect">
-                      <a:avLst/>
-                    </a:prstGeom>
-                    <a:noFill/>
-                    <a:ln w="9525">
-                      <a:noFill/>
-                      <a:headEnd/>
-                      <a:tailEnd/>
-                    </a:ln>
-                  </pic:spPr>
-                </pic:pic>
-              </a:graphicData>
-            </a:graphic>
-          </wp:inline>
-        </w:drawing>
-      </w:r>
-    </w:p>
-    <w:p>
-      <w:pPr>
-        <w:pStyle w:val="ImageCaption"/>
-      </w:pPr>
-      <w:r>
-        <w:t xml:space="preserve">DIAC Transfer Function</w:t>
-      </w:r>
-    </w:p>
-    <w:p>
-      <w:pPr>
-        <w:pStyle w:val="BodyText"/>
-      </w:pPr>
-      <w:r>
-        <w:t xml:space="preserve">The following shows a TRIAC with basic breakover voltages much higher than the peak voltage of the power signal, with Gate current injected to trigger the device at just under</w:t>
-      </w:r>
-      <w:r>
-        <w:t xml:space="preserve"> </w:t>
-      </w:r>
-      <m:oMath>
-        <m:r>
-          <m:t>24</m:t>
-        </m:r>
-        <m:r>
-          <m:t>V</m:t>
-        </m:r>
-      </m:oMath>
-      <w:r>
-        <w:t xml:space="preserve">, then</w:t>
-      </w:r>
-      <w:r>
-        <w:t xml:space="preserve"> </w:t>
-      </w:r>
-      <m:oMath>
-        <m:r>
-          <m:t>20</m:t>
-        </m:r>
-        <m:r>
-          <m:t>V</m:t>
-        </m:r>
-      </m:oMath>
-      <w:r>
-        <w:t xml:space="preserve"> </w:t>
-      </w:r>
-      <w:r>
-        <w:t xml:space="preserve">and finally</w:t>
-      </w:r>
-      <w:r>
-        <w:t xml:space="preserve"> </w:t>
-      </w:r>
-      <m:oMath>
-        <m:r>
-          <m:t>10</m:t>
-        </m:r>
-        <m:r>
-          <m:t>V</m:t>
-        </m:r>
-      </m:oMath>
-      <w:r>
-        <w:t xml:space="preserve">.</w:t>
-      </w:r>
-    </w:p>
-    <w:p>
-      <w:pPr>
-        <w:pStyle w:val="CaptionedFigure"/>
-      </w:pPr>
-      <w:r>
-        <w:drawing>
-          <wp:inline>
-            <wp:extent cx="4410075" cy="2638425"/>
-            <wp:effectExtent b="0" l="0" r="0" t="0"/>
-            <wp:docPr descr="TRIAC Output Current" title="" id="80" name="Picture"/>
-            <a:graphic>
-              <a:graphicData uri="http://schemas.openxmlformats.org/drawingml/2006/picture">
-                <pic:pic>
-                  <pic:nvPicPr>
-                    <pic:cNvPr descr="images/TRIACCurrentTrace.JPG" id="81" name="Picture"/>
-                    <pic:cNvPicPr>
-                      <a:picLocks noChangeArrowheads="1" noChangeAspect="1"/>
-                    </pic:cNvPicPr>
-                  </pic:nvPicPr>
-                  <pic:blipFill>
-                    <a:blip r:embed="rId79"/>
-                    <a:stretch>
-                      <a:fillRect/>
-                    </a:stretch>
-                  </pic:blipFill>
-                  <pic:spPr bwMode="auto">
-                    <a:xfrm>
-                      <a:off x="0" y="0"/>
-                      <a:ext cx="4410075" cy="2638425"/>
-                    </a:xfrm>
-                    <a:prstGeom prst="rect">
-                      <a:avLst/>
-                    </a:prstGeom>
-                    <a:noFill/>
-                    <a:ln w="9525">
-                      <a:noFill/>
-                      <a:headEnd/>
-                      <a:tailEnd/>
-                    </a:ln>
-                  </pic:spPr>
-                </pic:pic>
-              </a:graphicData>
-            </a:graphic>
-          </wp:inline>
-        </w:drawing>
-      </w:r>
-    </w:p>
-    <w:p>
-      <w:pPr>
-        <w:pStyle w:val="ImageCaption"/>
-      </w:pPr>
-      <w:r>
-        <w:t xml:space="preserve">TRIAC Output Current</w:t>
-      </w:r>
-    </w:p>
-    <w:p>
-      <w:pPr>
-        <w:pStyle w:val="BodyText"/>
-      </w:pPr>
-      <w:r>
-        <w:t xml:space="preserve">Here are the matching voltage curves for the current curves in the graph above:</w:t>
-      </w:r>
-    </w:p>
-    <w:p>
-      <w:pPr>
-        <w:pStyle w:val="CaptionedFigure"/>
-      </w:pPr>
-      <w:r>
-        <w:drawing>
-          <wp:inline>
-            <wp:extent cx="4400550" cy="2628900"/>
-            <wp:effectExtent b="0" l="0" r="0" t="0"/>
-            <wp:docPr descr="TRIAC Output Voltage" title="" id="83" name="Picture"/>
-            <a:graphic>
-              <a:graphicData uri="http://schemas.openxmlformats.org/drawingml/2006/picture">
-                <pic:pic>
-                  <pic:nvPicPr>
-                    <pic:cNvPr descr="images/TRIACVoltageTrace.JPG" id="84" name="Picture"/>
-                    <pic:cNvPicPr>
-                      <a:picLocks noChangeArrowheads="1" noChangeAspect="1"/>
-                    </pic:cNvPicPr>
-                  </pic:nvPicPr>
-                  <pic:blipFill>
-                    <a:blip r:embed="rId82"/>
-                    <a:stretch>
-                      <a:fillRect/>
-                    </a:stretch>
-                  </pic:blipFill>
-                  <pic:spPr bwMode="auto">
-                    <a:xfrm>
-                      <a:off x="0" y="0"/>
-                      <a:ext cx="4400550" cy="2628900"/>
-                    </a:xfrm>
-                    <a:prstGeom prst="rect">
-                      <a:avLst/>
-                    </a:prstGeom>
-                    <a:noFill/>
-                    <a:ln w="9525">
-                      <a:noFill/>
-                      <a:headEnd/>
-                      <a:tailEnd/>
-                    </a:ln>
-                  </pic:spPr>
-                </pic:pic>
-              </a:graphicData>
-            </a:graphic>
-          </wp:inline>
-        </w:drawing>
-      </w:r>
-    </w:p>
-    <w:p>
-      <w:pPr>
-        <w:pStyle w:val="ImageCaption"/>
-      </w:pPr>
-      <w:r>
-        <w:t xml:space="preserve">TRIAC Output Voltage</w:t>
-      </w:r>
-    </w:p>
-    <w:p>
-      <w:pPr>
-        <w:pStyle w:val="BodyText"/>
-      </w:pPr>
-      <w:r>
-        <w:t xml:space="preserve">Notice that, when the TRIAC is set to turn on for most of the cycle, the signal looks like just short spikes following the zero crossing points of the incoming signal, then the device remains turned on until the next zero crossing point.</w:t>
-      </w:r>
-    </w:p>
-    <w:p>
-      <w:pPr>
-        <w:pStyle w:val="BodyText"/>
-      </w:pPr>
-      <w:r>
-        <w:t xml:space="preserve">When connecting a modern TRIAC in a circuit, the Gate phase needs to be matched to the</w:t>
-      </w:r>
-      <w:r>
-        <w:t xml:space="preserve"> </w:t>
-      </w:r>
-      <m:oMath>
-        <m:sSub>
-          <m:e>
-            <m:r>
-              <m:t>A</m:t>
-            </m:r>
-          </m:e>
-          <m:sub>
-            <m:r>
-              <m:t>1</m:t>
-            </m:r>
-          </m:sub>
-        </m:sSub>
-      </m:oMath>
-      <w:r>
-        <w:t xml:space="preserve"> </w:t>
-      </w:r>
-      <w:r>
-        <w:t xml:space="preserve">anode.</w:t>
       </w:r>
     </w:p>
     <w:p>
@@ -3489,6 +3497,13 @@
         <w:br w:type="page"/>
       </w:r>
     </w:p>
+    <w:p>
+      <w:r>
+        <w:pict>
+          <v:rect style="width:0;height:1.5pt" o:hralign="center" o:hrstd="t" o:hr="t"/>
+        </w:pict>
+      </w:r>
+    </w:p>
     <w:bookmarkEnd w:id="95"/>
     <w:bookmarkEnd w:id="96"/>
     <w:bookmarkStart w:id="97" w:name="self-test-answers"/>
@@ -3500,7 +3515,6 @@
         <w:t xml:space="preserve">Self-Test Answers</w:t>
       </w:r>
     </w:p>
-    <w:bookmarkEnd w:id="97"/>
     <w:p>
       <w:pPr>
         <w:pStyle w:val="Compact"/>
@@ -3655,6 +3669,7 @@
         <w:t xml:space="preserve">circuit 3</w:t>
       </w:r>
     </w:p>
+    <w:bookmarkEnd w:id="97"/>
     <w:sectPr/>
   </w:body>
 </w:document>

</xml_diff>